<commit_message>
Add committee inputs and dean fields to form
Add a committee section with inputs for 3 members (name with datalist bound to ${committee} and a readonly role determined by index) before section (5). Replace the later committee block with dean fields: a dean_name input using a datalist bound to ${deans} and a prefilled position value "คณบดีวิทยาลัยการคอมพิวเตอร์". Also update the corresponding uploaded doc_2.docx binary.
</commit_message>
<xml_diff>
--- a/HRCP-KKU-Academic/uploads/academic/15/doc_2.docx
+++ b/HRCP-KKU-Academic/uploads/academic/15/doc_2.docx
@@ -1787,7 +1787,7 @@
                 <w:szCs w:val="28"/>
                 <w:lang w:val="en-US" w:eastAsia="en-GB"/>
               </w:rPr>
-              <w:t/>
+              <w:t>รองศาสตราจารย์สม ดี</w:t>
             </w:r>
             <w:proofErr w:type="spellStart"/>
             <w:r>
@@ -1838,7 +1838,7 @@
                 <w:szCs w:val="28"/>
                 <w:lang w:val="en-US" w:eastAsia="en-GB"/>
               </w:rPr>
-              <w:t/>
+              <w:t>คณบดีวิทยาลัยการคอมพิวเตอร์</w:t>
             </w:r>
             <w:proofErr w:type="spellStart"/>
             <w:r>

</xml_diff>